<commit_message>
#11. Projects on Dashboard Complete
</commit_message>
<xml_diff>
--- a/2nd week June 25 target.docx
+++ b/2nd week June 25 target.docx
@@ -81,9 +81,6 @@
         <w:t>create_project</w:t>
       </w:r>
       <w:proofErr w:type="spellEnd"/>
-      <w:r>
-        <w:t> </w:t>
-      </w:r>
     </w:p>
     <w:p>
       <w:pPr>
@@ -5221,6 +5218,7 @@
   <w:style w:type="character" w:default="1" w:styleId="DefaultParagraphFont">
     <w:name w:val="Default Paragraph Font"/>
     <w:uiPriority w:val="1"/>
+    <w:semiHidden/>
     <w:unhideWhenUsed/>
   </w:style>
   <w:style w:type="table" w:default="1" w:styleId="TableNormal">

</xml_diff>